<commit_message>
re-added dictionary code to try and get it and understand it.
</commit_message>
<xml_diff>
--- a/Assignment 1 Files/MarkingCriteria_Assignment1.docx
+++ b/Assignment 1 Files/MarkingCriteria_Assignment1.docx
@@ -383,7 +383,27 @@
                 <w:sz w:val="20"/>
                 <w:szCs w:val="20"/>
               </w:rPr>
-              <w:t>Abstract class is correct, inheritance used properly, calcRealDiff fully correct, clean structure</w:t>
+              <w:t xml:space="preserve">Abstract class is correct, inheritance used properly, </w:t>
+            </w:r>
+            <w:proofErr w:type="spellStart"/>
+            <w:r>
+              <w:rPr>
+                <w:rStyle w:val="normaltextrun"/>
+                <w:rFonts w:cs="Arial"/>
+                <w:sz w:val="20"/>
+                <w:szCs w:val="20"/>
+              </w:rPr>
+              <w:t>calcRealDiff</w:t>
+            </w:r>
+            <w:proofErr w:type="spellEnd"/>
+            <w:r>
+              <w:rPr>
+                <w:rStyle w:val="normaltextrun"/>
+                <w:rFonts w:cs="Arial"/>
+                <w:sz w:val="20"/>
+                <w:szCs w:val="20"/>
+              </w:rPr>
+              <w:t xml:space="preserve"> fully correct, clean structure</w:t>
             </w:r>
             <w:r>
               <w:rPr>
@@ -473,6 +493,17 @@
                 <w:szCs w:val="20"/>
               </w:rPr>
             </w:pPr>
+            <w:r>
+              <w:rPr>
+                <w:rStyle w:val="normaltextrun"/>
+                <w:rFonts w:cs="Arial"/>
+                <w:b/>
+                <w:bCs/>
+                <w:sz w:val="20"/>
+                <w:szCs w:val="20"/>
+              </w:rPr>
+              <w:t>5</w:t>
+            </w:r>
             <w:r>
               <w:rPr>
                 <w:rStyle w:val="normaltextrun"/>
@@ -670,6 +701,17 @@
                 <w:sz w:val="20"/>
                 <w:szCs w:val="20"/>
               </w:rPr>
+              <w:t>5</w:t>
+            </w:r>
+            <w:r>
+              <w:rPr>
+                <w:rStyle w:val="normaltextrun"/>
+                <w:rFonts w:cs="Arial"/>
+                <w:b/>
+                <w:bCs/>
+                <w:sz w:val="20"/>
+                <w:szCs w:val="20"/>
+              </w:rPr>
               <w:t>/5</w:t>
             </w:r>
             <w:r>
@@ -812,6 +854,17 @@
                 <w:sz w:val="20"/>
                 <w:szCs w:val="20"/>
               </w:rPr>
+              <w:t>5</w:t>
+            </w:r>
+            <w:r>
+              <w:rPr>
+                <w:rStyle w:val="normaltextrun"/>
+                <w:rFonts w:cs="Arial"/>
+                <w:b/>
+                <w:bCs/>
+                <w:sz w:val="20"/>
+                <w:szCs w:val="20"/>
+              </w:rPr>
               <w:t>/5</w:t>
             </w:r>
             <w:r>
@@ -972,6 +1025,17 @@
                 <w:sz w:val="20"/>
                 <w:szCs w:val="20"/>
               </w:rPr>
+              <w:t>30</w:t>
+            </w:r>
+            <w:r>
+              <w:rPr>
+                <w:rStyle w:val="normaltextrun"/>
+                <w:rFonts w:cs="Arial"/>
+                <w:b/>
+                <w:bCs/>
+                <w:sz w:val="20"/>
+                <w:szCs w:val="20"/>
+              </w:rPr>
               <w:t>/30</w:t>
             </w:r>
             <w:r>
@@ -1114,6 +1178,17 @@
                 <w:sz w:val="20"/>
                 <w:szCs w:val="20"/>
               </w:rPr>
+              <w:t>15</w:t>
+            </w:r>
+            <w:r>
+              <w:rPr>
+                <w:rStyle w:val="normaltextrun"/>
+                <w:rFonts w:cs="Arial"/>
+                <w:b/>
+                <w:bCs/>
+                <w:sz w:val="20"/>
+                <w:szCs w:val="20"/>
+              </w:rPr>
               <w:t>/1</w:t>
             </w:r>
             <w:r>
@@ -1285,6 +1360,17 @@
                 <w:sz w:val="20"/>
                 <w:szCs w:val="20"/>
               </w:rPr>
+              <w:t>5</w:t>
+            </w:r>
+            <w:r>
+              <w:rPr>
+                <w:rStyle w:val="normaltextrun"/>
+                <w:rFonts w:cs="Arial"/>
+                <w:b/>
+                <w:bCs/>
+                <w:sz w:val="20"/>
+                <w:szCs w:val="20"/>
+              </w:rPr>
               <w:t>/5</w:t>
             </w:r>
             <w:r>
@@ -1427,6 +1513,17 @@
                 <w:sz w:val="20"/>
                 <w:szCs w:val="20"/>
               </w:rPr>
+              <w:t>5</w:t>
+            </w:r>
+            <w:r>
+              <w:rPr>
+                <w:rStyle w:val="normaltextrun"/>
+                <w:rFonts w:cs="Arial"/>
+                <w:b/>
+                <w:bCs/>
+                <w:sz w:val="20"/>
+                <w:szCs w:val="20"/>
+              </w:rPr>
               <w:t>/5</w:t>
             </w:r>
             <w:r>
@@ -1569,6 +1666,17 @@
                 <w:sz w:val="20"/>
                 <w:szCs w:val="20"/>
               </w:rPr>
+              <w:t>5</w:t>
+            </w:r>
+            <w:r>
+              <w:rPr>
+                <w:rStyle w:val="normaltextrun"/>
+                <w:rFonts w:cs="Arial"/>
+                <w:b/>
+                <w:bCs/>
+                <w:sz w:val="20"/>
+                <w:szCs w:val="20"/>
+              </w:rPr>
               <w:t>/5</w:t>
             </w:r>
             <w:r>
@@ -1711,6 +1819,17 @@
                 <w:sz w:val="20"/>
                 <w:szCs w:val="20"/>
               </w:rPr>
+              <w:t>5</w:t>
+            </w:r>
+            <w:r>
+              <w:rPr>
+                <w:rStyle w:val="normaltextrun"/>
+                <w:rFonts w:cs="Arial"/>
+                <w:b/>
+                <w:bCs/>
+                <w:sz w:val="20"/>
+                <w:szCs w:val="20"/>
+              </w:rPr>
               <w:t>/5</w:t>
             </w:r>
             <w:r>
@@ -1827,6 +1946,17 @@
                 <w:szCs w:val="20"/>
               </w:rPr>
             </w:pPr>
+            <w:r>
+              <w:rPr>
+                <w:rStyle w:val="normaltextrun"/>
+                <w:rFonts w:cs="Arial"/>
+                <w:b/>
+                <w:bCs/>
+                <w:sz w:val="20"/>
+                <w:szCs w:val="20"/>
+              </w:rPr>
+              <w:t>10</w:t>
+            </w:r>
             <w:r>
               <w:rPr>
                 <w:rStyle w:val="normaltextrun"/>
@@ -2021,6 +2151,17 @@
                 <w:sz w:val="20"/>
                 <w:szCs w:val="20"/>
               </w:rPr>
+              <w:t>5</w:t>
+            </w:r>
+            <w:r>
+              <w:rPr>
+                <w:rStyle w:val="normaltextrun"/>
+                <w:rFonts w:cs="Arial"/>
+                <w:b/>
+                <w:bCs/>
+                <w:sz w:val="20"/>
+                <w:szCs w:val="20"/>
+              </w:rPr>
               <w:t>/5</w:t>
             </w:r>
             <w:r>
@@ -2195,6 +2336,17 @@
                 <w:szCs w:val="20"/>
               </w:rPr>
             </w:pPr>
+            <w:r>
+              <w:rPr>
+                <w:rStyle w:val="normaltextrun"/>
+                <w:rFonts w:cs="Arial"/>
+                <w:b/>
+                <w:bCs/>
+                <w:sz w:val="32"/>
+                <w:szCs w:val="32"/>
+              </w:rPr>
+              <w:t>95</w:t>
+            </w:r>
             <w:r>
               <w:rPr>
                 <w:rStyle w:val="normaltextrun"/>
@@ -5961,7 +6113,11 @@
 </file>
 
 <file path=customXml/item1.xml><?xml version="1.0" encoding="utf-8"?>
-<b:Sources xmlns:b="http://schemas.openxmlformats.org/officeDocument/2006/bibliography" xmlns="http://schemas.openxmlformats.org/officeDocument/2006/bibliography" SelectedStyle="\MLASeventhEditionOfficeOnline.xsl" StyleName="MLA" Version="7"/>
+<p:properties xmlns:p="http://schemas.microsoft.com/office/2006/metadata/properties" xmlns:xsi="http://www.w3.org/2001/XMLSchema-instance" xmlns:pc="http://schemas.microsoft.com/office/infopath/2007/PartnerControls">
+  <documentManagement>
+    <_activity xmlns="25492cb2-7415-413d-9083-388938000ed4" xsi:nil="true"/>
+  </documentManagement>
+</p:properties>
 </file>
 
 <file path=customXml/item2.xml><?xml version="1.0" encoding="utf-8"?>
@@ -6200,11 +6356,7 @@
 </file>
 
 <file path=customXml/item3.xml><?xml version="1.0" encoding="utf-8"?>
-<p:properties xmlns:p="http://schemas.microsoft.com/office/2006/metadata/properties" xmlns:xsi="http://www.w3.org/2001/XMLSchema-instance" xmlns:pc="http://schemas.microsoft.com/office/infopath/2007/PartnerControls">
-  <documentManagement>
-    <_activity xmlns="25492cb2-7415-413d-9083-388938000ed4" xsi:nil="true"/>
-  </documentManagement>
-</p:properties>
+<b:Sources xmlns:b="http://schemas.openxmlformats.org/officeDocument/2006/bibliography" xmlns="http://schemas.openxmlformats.org/officeDocument/2006/bibliography" SelectedStyle="\MLASeventhEditionOfficeOnline.xsl" StyleName="MLA" Version="7"/>
 </file>
 
 <file path=customXml/item4.xml><?xml version="1.0" encoding="utf-8"?>
@@ -6217,9 +6369,11 @@
 </file>
 
 <file path=customXml/itemProps1.xml><?xml version="1.0" encoding="utf-8"?>
-<ds:datastoreItem xmlns:ds="http://schemas.openxmlformats.org/officeDocument/2006/customXml" ds:itemID="{341318CA-1B7D-4924-987B-1C9318C91D7C}">
+<ds:datastoreItem xmlns:ds="http://schemas.openxmlformats.org/officeDocument/2006/customXml" ds:itemID="{4584C143-F662-49D3-9D64-E26F73651D3B}">
   <ds:schemaRefs>
-    <ds:schemaRef ds:uri="http://schemas.openxmlformats.org/officeDocument/2006/bibliography"/>
+    <ds:schemaRef ds:uri="http://schemas.microsoft.com/office/2006/metadata/properties"/>
+    <ds:schemaRef ds:uri="http://schemas.microsoft.com/office/infopath/2007/PartnerControls"/>
+    <ds:schemaRef ds:uri="25492cb2-7415-413d-9083-388938000ed4"/>
   </ds:schemaRefs>
 </ds:datastoreItem>
 </file>
@@ -6244,11 +6398,9 @@
 </file>
 
 <file path=customXml/itemProps3.xml><?xml version="1.0" encoding="utf-8"?>
-<ds:datastoreItem xmlns:ds="http://schemas.openxmlformats.org/officeDocument/2006/customXml" ds:itemID="{4584C143-F662-49D3-9D64-E26F73651D3B}">
+<ds:datastoreItem xmlns:ds="http://schemas.openxmlformats.org/officeDocument/2006/customXml" ds:itemID="{341318CA-1B7D-4924-987B-1C9318C91D7C}">
   <ds:schemaRefs>
-    <ds:schemaRef ds:uri="http://schemas.microsoft.com/office/2006/metadata/properties"/>
-    <ds:schemaRef ds:uri="http://schemas.microsoft.com/office/infopath/2007/PartnerControls"/>
-    <ds:schemaRef ds:uri="25492cb2-7415-413d-9083-388938000ed4"/>
+    <ds:schemaRef ds:uri="http://schemas.openxmlformats.org/officeDocument/2006/bibliography"/>
   </ds:schemaRefs>
 </ds:datastoreItem>
 </file>

</xml_diff>